<commit_message>
Describe the talk as prepared for the conference
README, paper, slides, announcement, register and metadata said the talk was presented on 3 September 2026. The published schedule of the conference does not support that statement, so the documents now say 'prepared for FOSS4G 2026' and claim nothing about the session. The register compares with 'deck v1' instead of 'stage'; tests/stage_values.yaml becomes tests/deck_values.yaml. The conference reference leaves CITATION.cff.

Also: neighbours are sorted in the contiguous null (the result depended on set order), legend in the class-share panel, title block in the Markdown paper.

Co-Authored-By: Claude Fable 5.1 <noreply@anthropic.com>
</commit_message>
<xml_diff>
--- a/docs/paper/paper.docx
+++ b/docs/paper/paper.docx
@@ -35,7 +35,13 @@
           <w:b/>
           <w:bCs/>
         </w:rPr>
-        <w:t xml:space="preserve">Presented as:</w:t>
+        <w:t xml:space="preserve">Prepared for:</w:t>
+      </w:r>
+      <w:r>
+        <w:t xml:space="preserve"> </w:t>
+      </w:r>
+      <w:r>
+        <w:t xml:space="preserve">FOSS4G 2026, Hiroshima, as the talk</w:t>
       </w:r>
       <w:r>
         <w:t xml:space="preserve"> </w:t>
@@ -44,7 +50,7 @@
         <w:t xml:space="preserve">“Eurostat vs OSM vs Census: Choosing Open Mobility Data for Urban Function Maps”</w:t>
       </w:r>
       <w:r>
-        <w:t xml:space="preserve">, FOSS4G 2026, Hiroshima, 3 September 2026.</w:t>
+        <w:t xml:space="preserve">.</w:t>
       </w:r>
       <w:r>
         <w:t xml:space="preserve"> </w:t>
@@ -166,7 +172,7 @@
         <w:t xml:space="preserve"> </w:t>
       </w:r>
       <w:r>
-        <w:t xml:space="preserve">moves from 17 % to 65 % with the threshold. Every number is generated by an open pipeline. Of 56 numbers in the deck of the talk, 46 are reproduced and 10 are corrected here.</w:t>
+        <w:t xml:space="preserve">moves from 17 % to 65 % with the threshold. Every number is generated by an open pipeline. Of 56 numbers in the first version of the slides, 46 are reproduced and 10 are corrected here.</w:t>
       </w:r>
     </w:p>
     <w:p>
@@ -594,7 +600,7 @@
         <w:pStyle w:val="FirstParagraph"/>
       </w:pPr>
       <w:r>
-        <w:t xml:space="preserve">The contributions are these. A closed form for the permutation null of partition self-containment (Eq. 4), which reduces the scale effect to two numbers. A second null of random contiguous partitions, and with it a three-part decomposition of self-containment into scale, contiguity and placement (Eq. 5). A spatial error matrix weighted by employed residents, from which intersection over union, omission and commission are read for every official area (Section 3.7). A record of a coding change between two censuses that moves a national indicator fivefold. A pipeline in which every number of the text is a test target, and a register that compares the numbers of the conference talk with the numbers of the pipeline.</w:t>
+        <w:t xml:space="preserve">The contributions are these. A closed form for the permutation null of partition self-containment (Eq. 4), which reduces the scale effect to two numbers. A second null of random contiguous partitions, and with it a three-part decomposition of self-containment into scale, contiguity and placement (Eq. 5). A spatial error matrix weighted by employed residents, from which intersection over union, omission and commission are read for every official area (Section 3.7). A record of a coding change between two censuses that moves a national indicator fivefold. A pipeline in which every number of the text is a test target, and a register that compares the numbers of the first version of the slides with the numbers of the pipeline.</w:t>
       </w:r>
     </w:p>
     <w:bookmarkEnd w:id="11"/>
@@ -5823,7 +5829,7 @@
         <w:t xml:space="preserve">golden_actual.yaml</w:t>
       </w:r>
       <w:r>
-        <w:t xml:space="preserve">. This text is rendered from a template whose placeholders name entries of that file, so no number is typed. A frozen copy is the regression target of the test suite. A second file holds the numbers of the deck of the talk; a generated register compares the two (Section 4.9). The run was repeated in a fresh environment built from the lock file and gave the same values.</w:t>
+        <w:t xml:space="preserve">. This text is rendered from a template whose placeholders name entries of that file, so no number is typed. A frozen copy is the regression target of the test suite. A second file holds the numbers of the first version of the slides; a generated register compares the two (Section 4.9). The run was repeated in a fresh environment built from the lock file and gave the same values.</w:t>
       </w:r>
     </w:p>
     <w:bookmarkEnd w:id="24"/>
@@ -8677,13 +8683,13 @@
       </w:r>
     </w:p>
     <w:bookmarkEnd w:id="75"/>
-    <w:bookmarkStart w:id="76" w:name="audit-of-the-deck-of-the-talk"/>
+    <w:bookmarkStart w:id="76" w:name="audit-of-the-first-version-of-the-slides"/>
     <w:p>
       <w:pPr>
         <w:pStyle w:val="Heading3"/>
       </w:pPr>
       <w:r>
-        <w:t xml:space="preserve">4.9 Audit of the deck of the talk</w:t>
+        <w:t xml:space="preserve">4.9 Audit of the first version of the slides</w:t>
       </w:r>
     </w:p>
     <w:p>
@@ -8691,7 +8697,7 @@
         <w:pStyle w:val="FirstParagraph"/>
       </w:pPr>
       <w:r>
-        <w:t xml:space="preserve">The deck prepared for the talk carried 56 numbers. The pipeline reproduces 46 within the rounding of the slide. The other 10:</w:t>
+        <w:t xml:space="preserve">The first version of the slides (deck v1) carried 56 numbers. The pipeline reproduces 46 within the rounding of the slide. The other 10:</w:t>
       </w:r>
     </w:p>
     <w:p>

</xml_diff>

<commit_message>
Add ORCID and state that the session was cancelled
ORCID 0009-0008-3040-5515 in CITATION.cff, .zenodo.json, paper and slides. README, paper, slides, announcement and docs/TALK.md say that the talk was accepted for FOSS4G 2026 and that the session was cancelled.

Co-Authored-By: Claude Fable 5.1 <noreply@anthropic.com>
</commit_message>
<xml_diff>
--- a/docs/paper/paper.docx
+++ b/docs/paper/paper.docx
@@ -15,7 +15,7 @@
         <w:pStyle w:val="Author"/>
       </w:pPr>
       <w:r>
-        <w:t xml:space="preserve">Marija Ercegovac, independent researcher</w:t>
+        <w:t xml:space="preserve">Marija Ercegovac, independent researcher, ORCID 0009-0008-3040-5515</w:t>
       </w:r>
     </w:p>
     <w:p>
@@ -50,7 +50,7 @@
         <w:t xml:space="preserve">“Eurostat vs OSM vs Census: Choosing Open Mobility Data for Urban Function Maps”</w:t>
       </w:r>
       <w:r>
-        <w:t xml:space="preserve">.</w:t>
+        <w:t xml:space="preserve">. The talk was accepted and the session was cancelled; the material is published here in full.</w:t>
       </w:r>
       <w:r>
         <w:t xml:space="preserve"> </w:t>

</xml_diff>

<commit_message>
Name all three categories that ONS counted at the residence
Co-Authored-By: Claude Opus 5.5 <noreply@anthropic.com>
</commit_message>
<xml_diff>
--- a/docs/paper/paper.docx
+++ b/docs/paper/paper.docx
@@ -160,7 +160,7 @@
         <w:t xml:space="preserve"> </w:t>
       </w:r>
       <w:r>
-        <w:t xml:space="preserve">the Simpson concentration of area sizes. A recombination Markov chain on spanning trees gives a second baseline: contiguous partitions with the same sizes. Over 11 partitions in three countries, the part of self-containment that depends on where the boundaries run is 0.06 to 0.22. Scale takes the largest part on Dutch municipalities, contiguity on English neighbourhoods. (3) The Coombes-Bond algorithm with the parameters of the official Travel to Work Areas gives 59 areas on the open 2011 matrix of commuters. Counting people who work at home at their residence, as the statistical office did, raises this to 95; the official map has 173. Of the Dutch COROP regions designed in 1970, 45 % meet the same validity rule on the pairs of 2023. (4) Temporal profiles of presence in Hiroshima form one cloud, so functional classes drawn from them are declared, not found. Every number in the text is produced by an open pipeline. Of the 56 numbers in the first version of the conference slides, 46 are reproduced and 10 are corrected.</w:t>
+        <w:t xml:space="preserve">the Simpson concentration of area sizes. A recombination Markov chain on spanning trees gives a second baseline: contiguous partitions with the same sizes. Over 11 partitions in three countries, the part of self-containment that depends on where the boundaries run is 0.06 to 0.22. Scale takes the largest part on Dutch municipalities, contiguity on English neighbourhoods. (3) The Coombes-Bond algorithm with the parameters of the official Travel to Work Areas gives 59 areas on the open 2011 matrix of commuters. Counting people who work at home or have no fixed workplace at their residence, as the statistical office did, raises this to 95; the official map has 173. Of the Dutch COROP regions designed in 1970, 45 % meet the same validity rule on the pairs of 2023. (4) Temporal profiles of presence in Hiroshima form one cloud, so functional classes drawn from them are declared, not found. Every number in the text is produced by an open pipeline. Of the 56 numbers in the first version of the conference slides, 46 are reproduced and 10 are corrected.</w:t>
       </w:r>
     </w:p>
     <w:p>
@@ -9530,7 +9530,7 @@
         <w:t xml:space="preserve"> </w:t>
       </w:r>
       <w:r>
-        <w:t xml:space="preserve">The validity rule of the official areas is public and simple. Two naive repairs that enforce it give 67 and 61 areas, and the standard construction gives 59 on the matrix of commuters. Counting people who work at home as ONS counted them raises the standard construction to 95; the official map has 173. The rule leaves the map open, and the construction and the code list decide it. The category of the code list that moves the diagonal share fivefold between two censuses (Section 4.1) also moves a national delimitation from 59 areas to 95. The count of areas and the raw score would not have shown what the error matrix and the placement term show.</w:t>
+        <w:t xml:space="preserve">The validity rule of the official areas is public and simple. Two naive repairs that enforce it give 67 and 61 areas, and the standard construction gives 59 on the matrix of commuters. Counting people who work at home or have no fixed workplace as ONS counted them raises the standard construction to 95; the official map has 173. The rule leaves the map open, and the construction and the code list decide it. The category of the code list that moves the diagonal share fivefold between two censuses (Section 4.1) also moves a national delimitation from 59 areas to 95. The count of areas and the raw score would not have shown what the error matrix and the placement term show.</w:t>
       </w:r>
     </w:p>
     <w:p>
@@ -10249,7 +10249,7 @@
         <w:pStyle w:val="FirstParagraph"/>
       </w:pPr>
       <w:r>
-        <w:t xml:space="preserve">Open sources of mobility differ in what they omit, and the omission is found in the code list and the definitions, not in the file. Where pairs exist, most of the self-containment of a functional-area map is produced by the sizes of the areas and by their contiguity. The part that depends on the position of the boundaries is 0.06 to 0.22 in three countries, and no construction leads on it everywhere. The coding of the source matters to a delimitation, not only to an indicator: counting people who work at home at their residence changes the standard construction for England and Wales from 59 areas to 95. The placement term, an error matrix against a reference counted in people, and the coding of the matrix are what we propose to report with any delimitation.</w:t>
+        <w:t xml:space="preserve">Open sources of mobility differ in what they omit, and the omission is found in the code list and the definitions, not in the file. Where pairs exist, most of the self-containment of a functional-area map is produced by the sizes of the areas and by their contiguity. The part that depends on the position of the boundaries is 0.06 to 0.22 in three countries, and no construction leads on it everywhere. The coding of the source matters to a delimitation, not only to an indicator: counting people who work at home or have no fixed workplace at their residence changes the standard construction for England and Wales from 59 areas to 95. The placement term, an error matrix against a reference counted in people, and the coding of the matrix are what we propose to report with any delimitation.</w:t>
       </w:r>
     </w:p>
     <w:bookmarkEnd w:id="75"/>

</xml_diff>